<commit_message>
Add Delayed Execution with Stale Context to spec evidence matrices; sync docx/pdf
</commit_message>
<xml_diff>
--- a/spec/A2SPA_Core_Protocol_Specification_v0.9.1_clean.docx
+++ b/spec/A2SPA_Core_Protocol_Specification_v0.9.1_clean.docx
@@ -1803,6 +1803,56 @@
             </w:pPr>
             <w:r>
               <w:t xml:space="preserve">Single-use Challenge Nonces and bounded TTL.</w:t>
+            </w:r>
+          </w:p>
+        </w:tc>
+        <w:tc>
+          <w:tcPr/>
+          <w:p>
+            <w:pPr>
+              <w:pStyle w:val="Compact"/>
+              <w:jc w:val="left"/>
+            </w:pPr>
+            <w:r>
+              <w:t xml:space="preserve">EEP generation and AV verification</w:t>
+            </w:r>
+          </w:p>
+        </w:tc>
+      </w:tr>
+      <w:tr>
+        <w:tc>
+          <w:tcPr/>
+          <w:p>
+            <w:pPr>
+              <w:pStyle w:val="Compact"/>
+              <w:jc w:val="left"/>
+            </w:pPr>
+            <w:r>
+              <w:t xml:space="preserve">Delayed Execution with Stale Context</w:t>
+            </w:r>
+          </w:p>
+        </w:tc>
+        <w:tc>
+          <w:tcPr/>
+          <w:p>
+            <w:pPr>
+              <w:pStyle w:val="Compact"/>
+              <w:jc w:val="left"/>
+            </w:pPr>
+            <w:r>
+              <w:t xml:space="preserve">Freshness Protection</w:t>
+            </w:r>
+          </w:p>
+        </w:tc>
+        <w:tc>
+          <w:tcPr/>
+          <w:p>
+            <w:pPr>
+              <w:pStyle w:val="Compact"/>
+              <w:jc w:val="left"/>
+            </w:pPr>
+            <w:r>
+              <w:t xml:space="preserve">Bounded Validity Interval + independent context revalidation.</w:t>
             </w:r>
           </w:p>
         </w:tc>
@@ -4636,6 +4686,68 @@
             </w:pPr>
             <w:r>
               <w:t xml:space="preserve">EEP nonce cache compromise.</w:t>
+            </w:r>
+          </w:p>
+        </w:tc>
+      </w:tr>
+      <w:tr>
+        <w:tc>
+          <w:tcPr/>
+          <w:p>
+            <w:pPr>
+              <w:pStyle w:val="Compact"/>
+              <w:jc w:val="left"/>
+            </w:pPr>
+            <w:r>
+              <w:t xml:space="preserve">Delayed Execution with Stale Context</w:t>
+            </w:r>
+          </w:p>
+        </w:tc>
+        <w:tc>
+          <w:tcPr/>
+          <w:p>
+            <w:pPr>
+              <w:pStyle w:val="Compact"/>
+              <w:jc w:val="left"/>
+            </w:pPr>
+            <w:r>
+              <w:t xml:space="preserve">Freshness Protection</w:t>
+            </w:r>
+          </w:p>
+        </w:tc>
+        <w:tc>
+          <w:tcPr/>
+          <w:p>
+            <w:pPr>
+              <w:pStyle w:val="Compact"/>
+              <w:jc w:val="left"/>
+            </w:pPr>
+            <w:r>
+              <w:t xml:space="preserve">Bounded Validity Interval enforced independently of nonce reuse</w:t>
+            </w:r>
+          </w:p>
+        </w:tc>
+        <w:tc>
+          <w:tcPr/>
+          <w:p>
+            <w:pPr>
+              <w:pStyle w:val="Compact"/>
+              <w:jc w:val="left"/>
+            </w:pPr>
+            <w:r>
+              <w:t xml:space="preserve">Execution outside the approved authorization window is denied even if the nonce is still technically unconsumed.</w:t>
+            </w:r>
+          </w:p>
+        </w:tc>
+        <w:tc>
+          <w:tcPr/>
+          <w:p>
+            <w:pPr>
+              <w:pStyle w:val="Compact"/>
+              <w:jc w:val="left"/>
+            </w:pPr>
+            <w:r>
+              <w:t xml:space="preserve">Authorization context (permissions, environment) drifting within an otherwise-valid TTL window.</w:t>
             </w:r>
           </w:p>
         </w:tc>

</xml_diff>